<commit_message>
fix: remove relocation and Linux from CV
Keep the CV focused on the revised role criteria and update its PDF and Word downloads.

Co-authored-by: Copilot <223556219+Copilot@users.noreply.github.com>
</commit_message>
<xml_diff>
--- a/public/chike_resume.docx
+++ b/public/chike_resume.docx
@@ -40,7 +40,7 @@
           <w:spacing w:val="0"/>
           <w:color w:val="116D5B"/>
         </w:rPr>
-        <w:t xml:space="preserve">Graduate Software Engineer | Python | C | Software Testing | Linux</w:t>
+        <w:t xml:space="preserve">Graduate Software Engineer | Python | C | Software Testing</w:t>
       </w:r>
       <w:r>
         <w:rPr>
@@ -64,7 +64,7 @@
           <w:spacing w:val="0"/>
           <w:color w:val="42524A"/>
         </w:rPr>
-        <w:t xml:space="preserve">Manchester, UK | Willing to relocate to Harpenden</w:t>
+        <w:t xml:space="preserve">Manchester, UK</w:t>
       </w:r>
       <w:r>
         <w:rPr>
@@ -371,7 +371,7 @@
           <w:spacing w:val="0"/>
           <w:color w:val="132722"/>
         </w:rPr>
-        <w:t xml:space="preserve"> Linux, Windows, Git, GitHub, GitLab, command line, GitHub Actions, GitLab CI, Docker fundamentals</w:t>
+        <w:t xml:space="preserve"> Windows, Git, GitHub, GitLab, command line, GitHub Actions, GitLab CI, Docker fundamentals</w:t>
       </w:r>
       <w:r>
         <w:rPr>
@@ -1881,17 +1881,17 @@
           <w:spacing w:val="0"/>
           <w:color w:val="132722"/>
         </w:rPr>
-        <w:t xml:space="preserve">Mobility:</w:t>
-      </w:r>
-      <w:r>
-        <w:rPr>
-          <w:rFonts w:ascii="Arial" w:hAnsi="Arial" w:cs="Arial"/>
-          <w:sz w:val="26"/>
-          <w:sz-cs w:val="26"/>
-          <w:spacing w:val="0"/>
-          <w:color w:val="132722"/>
-        </w:rPr>
-        <w:t xml:space="preserve"> Willing to relocate from Manchester to Harpenden or the surrounding area. Full UK manual driving licence.</w:t>
+        <w:t xml:space="preserve">Driving:</w:t>
+      </w:r>
+      <w:r>
+        <w:rPr>
+          <w:rFonts w:ascii="Arial" w:hAnsi="Arial" w:cs="Arial"/>
+          <w:sz w:val="26"/>
+          <w:sz-cs w:val="26"/>
+          <w:spacing w:val="0"/>
+          <w:color w:val="132722"/>
+        </w:rPr>
+        <w:t xml:space="preserve"> Full UK manual driving licence.</w:t>
       </w:r>
       <w:r>
         <w:rPr>
@@ -1925,7 +1925,7 @@
           <w:spacing w:val="0"/>
           <w:color w:val="132722"/>
         </w:rPr>
-        <w:t xml:space="preserve"> Systems programming, networking software, reliable distributed systems, Linux and AI-assisted software engineering.</w:t>
+        <w:t xml:space="preserve"> Systems programming, networking software, reliable distributed systems and AI-assisted software engineering.</w:t>
       </w:r>
       <w:r>
         <w:rPr>

</xml_diff>